<commit_message>
feat: bao cao tong ket tuan 4 + ket qua probe tuyen tinh nhanh D
- Bao cao WEEK04 (md + docx): output, muc tieu dat duoc, ket qua, han che,
  huong tiep, bang truy vet 100% so lieu -> script, venue du kien.
- probe_linear_bold.py: bo doc tuyen tinh tren feature ViT dong bang dat
  100,0% tren 120 cau (doi chung do net gop 81,7%) => 82,99% la tran cua
  phep do thu cong, khong phai cua tin hieu anh. 8 phep loai tru loi tat.
- Outline muc IV: ca bon dong A/B/C/D da co so do.
- PROGRESS_LOG: WEEK04 vao DA NOP; dong todo ablation da xong.
- .gitignore: bo *.npz trung gian cua probe (tai tao duoc), giu lin_items.jsonl.
</commit_message>
<xml_diff>
--- a/Slot 1/Outline Project - Hỏi đáp trên ảnh tài liệu (Document VQA).docx
+++ b/Slot 1/Outline Project - Hỏi đáp trên ảnh tài liệu (Document VQA).docx
@@ -1566,7 +1566,7 @@
           <w:bCs/>
           <w:rtl w:val="0"/>
         </w:rPr>
-        <w:t>Visual Bold Lookup (535 câu): 93,59 điểm (baseline TA) → 83,1 điểm (Cấu hình B). Trần tín hiệu ảnh 82,99% — đây là dư địa thật còn lại của hệ thống, hướng cho Cấu hình D.</w:t>
+        <w:t>Visual Bold Lookup (535 câu): 93,59 điểm (baseline TA) → 83,1 điểm (Cấu hình B). Trần phép đo thủ công 82,99% — KHÔNG phải trần của tín hiệu ảnh: bộ đọc tuyến tính trên feature ViT đóng băng đạt 100,0% trên 120 câu dev (Cấu hình D). Nút thắt nằm ở tầng so sánh của VLM, không phải ở tầng thị giác.</w:t>
       </w:r>
       <w:r>
         <w:rPr>
@@ -3055,12 +3055,13 @@
             <w:tcW w:w="2800" w:type="dxa"/>
           </w:tcPr>
           <w:p>
-            <w:r/>
+            <w:r>
+              <w:t>ĐÃ CHẠY — zero-shot kết luận âm; probe tuyến tính kết luận dương.</w:t>
+            </w:r>
             <w:r>
               <w:rPr>
                 <w:sz w:val="16"/>
               </w:rPr>
-              <w:t>CHƯA DỰNG — probe khả thi zero-shot cho kết luận âm.</w:t>
             </w:r>
           </w:p>
           <w:p>
@@ -3108,7 +3109,7 @@
               <w:rPr>
                 <w:sz w:val="16"/>
               </w:rPr>
-              <w:t>⇒ Zero-shot vô dụng. QLoRA là đường duy nhất còn lại, chờ TA xác nhận.</w:t>
+              <w:t>⇒ Zero-shot vô dụng ở tầng SO SÁNH. Nhưng probe tuyến tính trên feature ViT đóng băng đạt 100,0% ⇒ tín hiệu CÓ trong ảnh; QLoRA không cần thiết.</w:t>
             </w:r>
           </w:p>
         </w:tc>
@@ -3822,7 +3823,7 @@
           <w:rFonts w:hint="default" w:ascii="Times New Roman" w:hAnsi="Times New Roman" w:cs="Times New Roman" w:eastAsiaTheme="majorEastAsia"/>
           <w:b w:val="0"/>
         </w:rPr>
-        <w:t>Đã sửa xong 21/09. Harness cũ (audit_ceiling.py) tra text ô theo bbox bằng cách đọc cell_annotations.jsonl — file NHÃN — nên vi phạm ràng buộc hợp lệ của chính dự án và không chạy được trên public_test / private_test. Harness mới (oracle_ceiling.py) chỉ dùng ocr/*.json và ảnh trang: gom block theo y0, sắp theo x0 để tái dựng lưới, rồi khớp bbox bằng chứng vàng với block OCR gần nhất. Tính hợp lệ được kiểm tự động bằng check_validity.py (đổi tên file nhãn rồi chạy lại, kết quả không đổi). Trần oracle: 10.909/11.000 = 99,17% — dev 99,16% · eval 99,23%, chênh 0,07 điểm % ⇒ lưới không phụ thuộc tài liệu nào. Phần thiếu 0,83% nằm trọn ở visual_bold_lookup (82,99%): is_bold là trường duy nhất không có tương ứng trong OCR (đề bài ghi rõ "OCR không ghi nhận định dạng chữ"), và 5 phép đo độ dày nét khác nhau đều dừng ở 82,99% ⇒ đây là trần của tín hiệu ảnh, không phải lỗi cài đặt.</w:t>
+        <w:t>Đã sửa xong 21/09. Harness cũ (audit_ceiling.py) tra text ô theo bbox bằng cách đọc cell_annotations.jsonl — file NHÃN — nên vi phạm ràng buộc hợp lệ của chính dự án và không chạy được trên public_test / private_test. Harness mới (oracle_ceiling.py) chỉ dùng ocr/*.json và ảnh trang: gom block theo y0, sắp theo x0 để tái dựng lưới, rồi khớp bbox bằng chứng vàng với block OCR gần nhất. Tính hợp lệ được kiểm tự động bằng check_validity.py (đổi tên file nhãn rồi chạy lại, kết quả không đổi). Trần oracle: 10.909/11.000 = 99,17% — dev 99,16% · eval 99,23%, chênh 0,07 điểm % ⇒ lưới không phụ thuộc tài liệu nào. Phần thiếu 0,83% nằm trọn ở visual_bold_lookup (82,99%): is_bold là trường duy nhất không có tương ứng trong OCR (đề bài ghi rõ "OCR không ghi nhận định dạng chữ"), và 5 phép đo độ dày nét khác nhau đều dừng ở 82,99% ⇒ đây là trần của PHÉP ĐO thủ công, KHÔNG phải của tín hiệu ảnh (bộ đọc tuyến tính trên feature ViT đóng băng lấy ra 100% tín hiệu đó), không phải lỗi cài đặt.</w:t>
       </w:r>
     </w:p>
     <w:p>

</xml_diff>